<commit_message>
Restaurar credenciales demo en login y retirar GitHub Pages
- Login vuelve a precargar admin@medisalud.com / medisalud2026 con el
  recuadro Demo visible.
- Se elimina el workflow de Pages, el basename del router, el origen
  github.io del CORS y las secciones de Pages en README y manual de
  instalacion.

Co-Authored-By: Claude Fable 5 <noreply@anthropic.com>
</commit_message>
<xml_diff>
--- a/docs/Manual_Instalacion_GRM_Medisalud.docx
+++ b/docs/Manual_Instalacion_GRM_Medisalud.docx
@@ -580,7 +580,7 @@
         <w:t xml:space="preserve">Credenciales de demostración: </w:t>
       </w:r>
       <w:r>
-        <w:t>admin@medisalud.com / medisalud2026 — el formulario de login no las precarga por seguridad; escríbalas manualmente. También puede crear una cuenta nueva desde /registro.</w:t>
+        <w:t>admin@medisalud.com / medisalud2026 (el formulario de login las precarga por comodidad). También puede crear una cuenta nueva desde /registro.</w:t>
       </w:r>
     </w:p>
     <w:p>
@@ -739,39 +739,7 @@
           <w:color w:val="722F37"/>
           <w:sz w:val="26"/>
         </w:rPr>
-        <w:t>8. GitHub Pages (solo frontend)</w:t>
-      </w:r>
-    </w:p>
-    <w:p>
-      <w:r>
-        <w:t>Cada push a la rama main publica el frontend en https://josselyn12g.github.io/MediSaludSGI2026/ mediante GitHub Actions (.github/workflows/deploy-pages.yml). Requiere activar una vez: Settings → Pages → Source: GitHub Actions.</w:t>
-      </w:r>
-    </w:p>
-    <w:p>
-      <w:r>
-        <w:rPr>
-          <w:b/>
-        </w:rPr>
-        <w:t xml:space="preserve">Limitación: </w:t>
-      </w:r>
-      <w:r>
-        <w:t>Pages no ejecuta Django. Para que el login funcione en la página publicada, defina la variable de repositorio VITE_API_URL (Settings → Secrets and variables → Actions → Variables) apuntando a un backend público, por ejemplo https://xxxx.ngrok-free.app/api. El CORS del backend ya permite el origen josselyn12g.github.io.</w:t>
-      </w:r>
-    </w:p>
-    <w:p>
-      <w:pPr>
-        <w:spacing w:before="200" w:after="60"/>
-        <w:pBdr>
-          <w:bottom w:val="single" w:sz="6" w:space="1" w:color="722F37"/>
-        </w:pBdr>
-      </w:pPr>
-      <w:r>
-        <w:rPr>
-          <w:b/>
-          <w:color w:val="722F37"/>
-          <w:sz w:val="26"/>
-        </w:rPr>
-        <w:t>9. Solución de problemas frecuentes</w:t>
+        <w:t>8. Solución de problemas frecuentes</w:t>
       </w:r>
     </w:p>
     <w:p>

</xml_diff>